<commit_message>
Auto-deploy: rebuild site (2026-10-04 03:15)
</commit_message>
<xml_diff>
--- a/docs/downloads/gerrid-setzer/تم/doc_0170.docx
+++ b/docs/downloads/gerrid-setzer/تم/doc_0170.docx
@@ -1,404 +1,493 @@
 
 <file path=word/document.xml><?xml version="1.0" encoding="utf-8"?>
-<w:document xmlns:wpc="http://schemas.microsoft.com/office/word/2010/wordprocessingCanvas" xmlns:cx="http://schemas.microsoft.com/office/drawing/2014/chartex" xmlns:cx1="http://schemas.microsoft.com/office/drawing/2015/9/8/chartex" xmlns:cx2="http://schemas.microsoft.com/office/drawing/2015/10/21/chartex" xmlns:cx3="http://schemas.microsoft.com/office/drawing/2016/5/9/chartex" xmlns:cx4="http://schemas.microsoft.com/office/drawing/2016/5/10/chartex" xmlns:cx5="http://schemas.microsoft.com/office/drawing/2016/5/11/chartex" xmlns:cx6="http://schemas.microsoft.com/office/drawing/2016/5/12/chartex" xmlns:cx7="http://schemas.microsoft.com/office/drawing/2016/5/13/chartex" xmlns:cx8="http://schemas.microsoft.com/office/drawing/2016/5/14/chartex" xmlns:mc="http://schemas.openxmlformats.org/markup-compatibility/2006" xmlns:aink="http://schemas.microsoft.com/office/drawing/2016/ink" xmlns:am3d="http://schemas.microsoft.com/office/drawing/2017/model3d" xmlns:o="urn:schemas-microsoft-com:office:office" xmlns:r="http://schemas.openxmlformats.org/officeDocument/2006/relationships" xmlns:m="http://schemas.openxmlformats.org/officeDocument/2006/math" xmlns:v="urn:schemas-microsoft-com:vml" xmlns:wp14="http://schemas.microsoft.com/office/word/2010/wordprocessingDrawing" xmlns:wp="http://schemas.openxmlformats.org/drawingml/2006/wordprocessingDrawing" xmlns:w10="urn:schemas-microsoft-com:office:word" xmlns:w="http://schemas.openxmlformats.org/wordprocessingml/2006/main" xmlns:w14="http://schemas.microsoft.com/office/word/2010/wordml" xmlns:w15="http://schemas.microsoft.com/office/word/2012/wordml" xmlns:w16cex="http://schemas.microsoft.com/office/word/2018/wordml/cex" xmlns:w16cid="http://schemas.microsoft.com/office/word/2016/wordml/cid" xmlns:w16="http://schemas.microsoft.com/office/word/2018/wordml" xmlns:w16sdtdh="http://schemas.microsoft.com/office/word/2020/wordml/sdtdatahash" xmlns:w16se="http://schemas.microsoft.com/office/word/2015/wordml/symex" xmlns:wpg="http://schemas.microsoft.com/office/word/2010/wordprocessingGroup" xmlns:wpi="http://schemas.microsoft.com/office/word/2010/wordprocessingInk" xmlns:wne="http://schemas.microsoft.com/office/word/2006/wordml" xmlns:wps="http://schemas.microsoft.com/office/word/2010/wordprocessingShape" mc:Ignorable="w14 w15 w16se w16cid w16 w16cex w16sdtdh wp14">
+<w:document xmlns:wpc="http://schemas.microsoft.com/office/word/2010/wordprocessingCanvas" xmlns:cx="http://schemas.microsoft.com/office/drawing/2014/chartex" xmlns:cx1="http://schemas.microsoft.com/office/drawing/2015/9/8/chartex" xmlns:cx2="http://schemas.microsoft.com/office/drawing/2015/10/21/chartex" xmlns:cx3="http://schemas.microsoft.com/office/drawing/2016/5/9/chartex" xmlns:cx4="http://schemas.microsoft.com/office/drawing/2016/5/10/chartex" xmlns:cx5="http://schemas.microsoft.com/office/drawing/2016/5/11/chartex" xmlns:cx6="http://schemas.microsoft.com/office/drawing/2016/5/12/chartex" xmlns:cx7="http://schemas.microsoft.com/office/drawing/2016/5/13/chartex" xmlns:cx8="http://schemas.microsoft.com/office/drawing/2016/5/14/chartex" xmlns:mc="http://schemas.openxmlformats.org/markup-compatibility/2006" xmlns:aink="http://schemas.microsoft.com/office/drawing/2016/ink" xmlns:am3d="http://schemas.microsoft.com/office/drawing/2017/model3d" xmlns:o="urn:schemas-microsoft-com:office:office" xmlns:r="http://schemas.openxmlformats.org/officeDocument/2006/relationships" xmlns:m="http://schemas.openxmlformats.org/officeDocument/2006/math" xmlns:v="urn:schemas-microsoft-com:vml" xmlns:wp14="http://schemas.microsoft.com/office/word/2010/wordprocessingDrawing" xmlns:wp="http://schemas.openxmlformats.org/drawingml/2006/wordprocessingDrawing" xmlns:w10="urn:schemas-microsoft-com:office:word" xmlns:w="http://schemas.openxmlformats.org/wordprocessingml/2006/main" xmlns:w14="http://schemas.microsoft.com/office/word/2010/wordml" xmlns:w15="http://schemas.microsoft.com/office/word/2012/wordml" xmlns:w16cid="http://schemas.microsoft.com/office/word/2016/wordml/cid" xmlns:w16se="http://schemas.microsoft.com/office/word/2015/wordml/symex" xmlns:wpg="http://schemas.microsoft.com/office/word/2010/wordprocessingGroup" xmlns:wpi="http://schemas.microsoft.com/office/word/2010/wordprocessingInk" xmlns:wne="http://schemas.microsoft.com/office/word/2006/wordml" xmlns:wps="http://schemas.microsoft.com/office/word/2010/wordprocessingShape" mc:Ignorable="w14 w15 w16se w16cid wp14">
   <w:body>
     <w:p>
       <w:pPr>
-        <w:bidi/>
-        <w:jc w:val="both"/>
-        <w:rPr>
-          <w:rtl/>
-        </w:rPr>
-      </w:pPr>
-      <w:hyperlink r:id="rId4" w:history="1">
+        <w:jc w:val="center"/>
+        <w:rPr>
+          <w:rtl/>
+          <w:lang w:bidi="ar-AE"/>
+        </w:rPr>
+      </w:pPr>
+      <w:hyperlink r:id="rId5" w:history="1">
         <w:r>
           <w:rPr>
             <w:rStyle w:val="Hyperlink"/>
+            <w:rFonts w:hint="cs"/>
             <w:rtl/>
+            <w:lang w:bidi="ar-AE"/>
           </w:rPr>
-          <w:t>إحصاء أيامنا</w:t>
+          <w:t>3 أصدقاء</w:t>
         </w:r>
       </w:hyperlink>
     </w:p>
     <w:p>
       <w:pPr>
         <w:jc w:val="both"/>
-      </w:pPr>
-      <w:r>
-        <w:t>Gerrid Setzer</w:t>
+        <w:rPr>
+          <w:rtl/>
+          <w:lang w:bidi="ar-AE"/>
+        </w:rPr>
+      </w:pPr>
+      <w:r>
+        <w:rPr>
+          <w:rFonts w:hint="cs"/>
+          <w:rtl/>
+          <w:lang w:bidi="ar-AE"/>
+        </w:rPr>
+        <w:t>لوقا 11: 5 -10</w:t>
       </w:r>
     </w:p>
     <w:p>
       <w:pPr>
-        <w:bidi/>
         <w:jc w:val="both"/>
         <w:rPr>
-          <w:rtl/>
-        </w:rPr>
-      </w:pPr>
-      <w:r>
-        <w:rPr>
-          <w:rtl/>
-        </w:rPr>
-        <w:t>مزمور 90: 12 – 17</w:t>
+          <w:lang w:bidi="ar-AE"/>
+        </w:rPr>
+      </w:pPr>
+      <w:bookmarkStart w:id="0" w:name="_GoBack"/>
+      <w:r>
+        <w:rPr>
+          <w:lang w:bidi="ar-AE"/>
+        </w:rPr>
+        <w:t>Gerrid Setzer</w:t>
+      </w:r>
+    </w:p>
+    <w:bookmarkEnd w:id="0"/>
+    <w:p>
+      <w:pPr>
+        <w:jc w:val="both"/>
+        <w:rPr>
+          <w:rtl/>
+          <w:lang w:bidi="ar-AE"/>
+        </w:rPr>
+      </w:pPr>
+      <w:r>
+        <w:rPr>
+          <w:rFonts w:hint="cs"/>
+          <w:rtl/>
+          <w:lang w:bidi="ar-AE"/>
+        </w:rPr>
+        <w:t xml:space="preserve">المقطع في لوقا 11: 5 </w:t>
+      </w:r>
+      <w:r>
+        <w:rPr>
+          <w:rtl/>
+          <w:lang w:bidi="ar-AE"/>
+        </w:rPr>
+        <w:t>–</w:t>
+      </w:r>
+      <w:r>
+        <w:rPr>
+          <w:rFonts w:hint="cs"/>
+          <w:rtl/>
+          <w:lang w:bidi="ar-AE"/>
+        </w:rPr>
+        <w:t xml:space="preserve"> 10 يتكلم عن 3 أصدقاء: فالصديق الأول يأتي </w:t>
+      </w:r>
+      <w:r>
+        <w:rPr>
+          <w:rFonts w:hint="cs"/>
+          <w:rtl/>
+          <w:lang w:bidi="ar-AE"/>
+        </w:rPr>
+        <w:t>نحو</w:t>
+      </w:r>
+      <w:r>
+        <w:rPr>
+          <w:rFonts w:hint="cs"/>
+          <w:rtl/>
+          <w:lang w:bidi="ar-AE"/>
+        </w:rPr>
+        <w:t xml:space="preserve"> نصف الليل إلى صديقه الثاني. وهو يود بأن يقدّم له شيئًا ولكنه لا يوجد لديه شيء ولذا ذهب إلى صديقه الثالث ليحصل منه على شيء ما.</w:t>
       </w:r>
     </w:p>
     <w:p>
       <w:pPr>
-        <w:bidi/>
+        <w:pStyle w:val="ListParagraph"/>
+        <w:numPr>
+          <w:ilvl w:val="0"/>
+          <w:numId w:val="1"/>
+        </w:numPr>
         <w:jc w:val="both"/>
         <w:rPr>
-          <w:rtl/>
-        </w:rPr>
-      </w:pPr>
-      <w:r>
-        <w:rPr>
-          <w:rtl/>
-        </w:rPr>
-        <w:t xml:space="preserve">مزمور 90 هو صلاة من موسى سجّلها أثناء </w:t>
-      </w:r>
-      <w:r>
-        <w:rPr>
-          <w:rFonts w:hint="cs"/>
-          <w:rtl/>
-        </w:rPr>
-        <w:t>رحلته</w:t>
-      </w:r>
-      <w:r>
-        <w:rPr>
-          <w:rtl/>
-        </w:rPr>
-        <w:t xml:space="preserve"> الطويل</w:t>
-      </w:r>
-      <w:r>
-        <w:rPr>
-          <w:rFonts w:hint="cs"/>
-          <w:rtl/>
-        </w:rPr>
-        <w:t>ة</w:t>
-      </w:r>
-      <w:r>
-        <w:rPr>
-          <w:rtl/>
-        </w:rPr>
-        <w:t xml:space="preserve"> في البرية. وكان انطباعه متأثرًا جدًا كم</w:t>
-      </w:r>
-      <w:r>
-        <w:rPr>
-          <w:rtl/>
-        </w:rPr>
-        <w:t xml:space="preserve"> هي</w:t>
-      </w:r>
-      <w:r>
-        <w:rPr>
-          <w:rtl/>
-        </w:rPr>
-        <w:t xml:space="preserve"> الحياة فانية. الموت يجرف بالناس دون أية مقاومة منهم ويُنهي حياتهم التي كالمنام تزول، وكما يُجزّ العشب المزهر (مزمور 90: 5، 6). إن شعور موسى اشتد أكثر عندما رأى الكثير من الناس يموتون: كل جيل المحاربين فني في البرية لأجل عدم إيمانهم (تثنية 2: 14). غضب الله طرح الإسرائيليين ألف مرة أرضًا (قارن مزمور 90: 7 – 11). غير أن موسى علم أين يجد مولود</w:t>
-      </w:r>
-      <w:r>
-        <w:rPr>
-          <w:rtl/>
-        </w:rPr>
-        <w:t>و</w:t>
-      </w:r>
-      <w:r>
-        <w:rPr>
-          <w:rtl/>
-        </w:rPr>
-        <w:t xml:space="preserve"> التراب ملجأهم: مع الله الأبدي. هذا الإله كان موجودًا حينما وُلدت أجيال في الماضي، حينما وُلدت الخليقة العظيمة – نعم، منذ الأزل هو الله. وهذا الله العظيم، الذي في عينيه ألف سنة كيوم أمس، هو مسكن الذين يتكلون عليه (مزمور 90: 1 – 4).</w:t>
+          <w:lang w:bidi="ar-AE"/>
+        </w:rPr>
+      </w:pPr>
+      <w:r>
+        <w:rPr>
+          <w:rFonts w:hint="cs"/>
+          <w:rtl/>
+          <w:lang w:bidi="ar-AE"/>
+        </w:rPr>
+        <w:t>الصديق الأول محتاج (= مؤمن في ضائقة).</w:t>
       </w:r>
     </w:p>
     <w:p>
       <w:pPr>
-        <w:bidi/>
+        <w:pStyle w:val="ListParagraph"/>
+        <w:numPr>
+          <w:ilvl w:val="0"/>
+          <w:numId w:val="1"/>
+        </w:numPr>
         <w:jc w:val="both"/>
         <w:rPr>
-          <w:rtl/>
-        </w:rPr>
-      </w:pPr>
-      <w:r>
-        <w:rPr>
-          <w:rtl/>
-        </w:rPr>
-        <w:t>باتضاع يصلي موسى إلى إله الزمان الغابر ويطرح 8 طلبات أمامه (مزمور 90: 12 – 17). يا ليت الله:</w:t>
+          <w:lang w:bidi="ar-AE"/>
+        </w:rPr>
+      </w:pPr>
+      <w:r>
+        <w:rPr>
+          <w:rFonts w:hint="cs"/>
+          <w:rtl/>
+          <w:lang w:bidi="ar-AE"/>
+        </w:rPr>
+        <w:t>الصديق الثاني وسيط (=مؤمن له علاقة وثيقة بالله).</w:t>
       </w:r>
     </w:p>
     <w:p>
       <w:pPr>
-        <w:bidi/>
-        <w:spacing w:after="0"/>
+        <w:pStyle w:val="ListParagraph"/>
+        <w:numPr>
+          <w:ilvl w:val="0"/>
+          <w:numId w:val="1"/>
+        </w:numPr>
         <w:jc w:val="both"/>
         <w:rPr>
-          <w:rtl/>
-        </w:rPr>
-      </w:pPr>
-      <w:r>
-        <w:rPr>
-          <w:rtl/>
-        </w:rPr>
-        <w:t>* ... يعلّم الإسرائيليين إحصاء أيام حياتهم ليؤتون قلب حكمة.</w:t>
+          <w:lang w:bidi="ar-AE"/>
+        </w:rPr>
+      </w:pPr>
+      <w:r>
+        <w:rPr>
+          <w:rFonts w:hint="cs"/>
+          <w:rtl/>
+          <w:lang w:bidi="ar-AE"/>
+        </w:rPr>
+        <w:t>الصديق الثالث يُعطي قدر الاحتياج (= الله بذاته).</w:t>
       </w:r>
     </w:p>
     <w:p>
       <w:pPr>
-        <w:bidi/>
-        <w:spacing w:after="0"/>
         <w:jc w:val="both"/>
         <w:rPr>
           <w:rtl/>
-        </w:rPr>
-      </w:pPr>
-      <w:r>
-        <w:rPr>
-          <w:rtl/>
-        </w:rPr>
-        <w:t>* ... يعيدهم إلى ألطافه بطرح غضبه عنهم.</w:t>
+          <w:lang w:bidi="ar-AE"/>
+        </w:rPr>
+      </w:pPr>
+      <w:r>
+        <w:rPr>
+          <w:rFonts w:hint="cs"/>
+          <w:rtl/>
+          <w:lang w:bidi="ar-AE"/>
+        </w:rPr>
+        <w:t xml:space="preserve">الصديق الأول يأتي </w:t>
+      </w:r>
+      <w:r>
+        <w:rPr>
+          <w:rFonts w:hint="cs"/>
+          <w:rtl/>
+          <w:lang w:bidi="ar-AE"/>
+        </w:rPr>
+        <w:t>نحو</w:t>
+      </w:r>
+      <w:r>
+        <w:rPr>
+          <w:rFonts w:hint="cs"/>
+          <w:rtl/>
+          <w:lang w:bidi="ar-AE"/>
+        </w:rPr>
+        <w:t xml:space="preserve"> نصف الليل عند صديقه. من الواضح أنه لم يُنبئه بمجيئه، وإلا كان سيهتم الصديق الثاني بطلبه. </w:t>
+      </w:r>
+      <w:r>
+        <w:rPr>
+          <w:rFonts w:hint="cs"/>
+          <w:rtl/>
+          <w:lang w:bidi="ar-AE"/>
+        </w:rPr>
+        <w:t xml:space="preserve">تصرفه يُري ثقة جريئة بصديقه </w:t>
+      </w:r>
+      <w:r>
+        <w:rPr>
+          <w:rtl/>
+          <w:lang w:bidi="ar-AE"/>
+        </w:rPr>
+        <w:t>–</w:t>
+      </w:r>
+      <w:r>
+        <w:rPr>
+          <w:rFonts w:hint="cs"/>
+          <w:rtl/>
+          <w:lang w:bidi="ar-AE"/>
+        </w:rPr>
+        <w:t xml:space="preserve"> ربما أيضًا الناس تثق بنا. كيف نتصرف في هذا الحال؟، ماذا يجب أن نفعله؟</w:t>
       </w:r>
     </w:p>
     <w:p>
       <w:pPr>
-        <w:bidi/>
-        <w:spacing w:after="0"/>
         <w:jc w:val="both"/>
         <w:rPr>
           <w:rtl/>
-        </w:rPr>
-      </w:pPr>
-      <w:r>
-        <w:rPr>
-          <w:rtl/>
-        </w:rPr>
-        <w:t>* ... يندم وينهي الأيام العصيبة.</w:t>
+          <w:lang w:bidi="ar-AE"/>
+        </w:rPr>
+      </w:pPr>
+      <w:r>
+        <w:rPr>
+          <w:rFonts w:hint="cs"/>
+          <w:rtl/>
+          <w:lang w:bidi="ar-AE"/>
+        </w:rPr>
+        <w:t xml:space="preserve">الصديق الثاني يفعل ما هو صحيح. هو يدرك بأنه لا يمكنه أن يعين نفسه، لكنه يعلم أين هو الخبز. ولذا قام </w:t>
+      </w:r>
+      <w:r>
+        <w:rPr>
+          <w:rFonts w:hint="cs"/>
+          <w:rtl/>
+          <w:lang w:bidi="ar-AE"/>
+        </w:rPr>
+        <w:t>ولجأ</w:t>
+      </w:r>
+      <w:r>
+        <w:rPr>
+          <w:rFonts w:hint="cs"/>
+          <w:rtl/>
+          <w:lang w:bidi="ar-AE"/>
+        </w:rPr>
+        <w:t xml:space="preserve"> إلى مَن لديه القليل منه. هو لم يخجل بأن يقرع على باب الصديق الثالث في نصف الليل.</w:t>
       </w:r>
     </w:p>
     <w:p>
       <w:pPr>
-        <w:bidi/>
-        <w:spacing w:after="0"/>
         <w:jc w:val="both"/>
         <w:rPr>
           <w:rtl/>
-        </w:rPr>
-      </w:pPr>
-      <w:r>
-        <w:rPr>
-          <w:rtl/>
-        </w:rPr>
-        <w:t>* ... يسدّ احتياجاتهم برحمته ليتهللوا.</w:t>
+          <w:lang w:bidi="ar-AE"/>
+        </w:rPr>
+      </w:pPr>
+      <w:r>
+        <w:rPr>
+          <w:rFonts w:hint="cs"/>
+          <w:rtl/>
+          <w:lang w:bidi="ar-AE"/>
+        </w:rPr>
+        <w:t xml:space="preserve">كيف سيكون رد فعل الصديق الثالث؟ حسنًا، من المؤكد أنه سيعطيه. وإن ليس لأجل صداقته، وإنما لأجل الإلحاح في طلبه. </w:t>
+      </w:r>
+      <w:r>
+        <w:rPr>
+          <w:rtl/>
+          <w:lang w:bidi="ar-AE"/>
+        </w:rPr>
+        <w:t>–</w:t>
+      </w:r>
+      <w:r>
+        <w:rPr>
+          <w:rFonts w:hint="cs"/>
+          <w:rtl/>
+          <w:lang w:bidi="ar-AE"/>
+        </w:rPr>
+        <w:t xml:space="preserve"> وإن كان الناس يتصرفون بهذا الشكل، فكم يكون بالحري مع إلهنا الصالح، الذي لا ينعس ولا ينام! لننتبه أيضًا، بأن الصديق الثالث يعطي بقدر احتياج الصديق الثاني، وليس ببساطة ما يطلبه. إن هذا ينطبق تمامًا على صلواتنا.</w:t>
       </w:r>
     </w:p>
     <w:p>
       <w:pPr>
-        <w:bidi/>
-        <w:spacing w:after="0"/>
         <w:jc w:val="both"/>
         <w:rPr>
           <w:rtl/>
-        </w:rPr>
-      </w:pPr>
-      <w:r>
-        <w:rPr>
-          <w:rtl/>
-        </w:rPr>
-        <w:t>* ... يمنحهم فرحًا جديدًا من بعد الوقت العصيب.</w:t>
+          <w:lang w:bidi="ar-AE"/>
+        </w:rPr>
+      </w:pPr>
+      <w:r>
+        <w:rPr>
+          <w:rFonts w:hint="cs"/>
+          <w:rtl/>
+          <w:lang w:bidi="ar-AE"/>
+        </w:rPr>
+        <w:t>مناشدة / استنتاج:</w:t>
+      </w:r>
+      <w:r>
+        <w:rPr>
+          <w:rFonts w:hint="cs"/>
+          <w:rtl/>
+          <w:lang w:bidi="ar-AE"/>
+        </w:rPr>
+        <w:t xml:space="preserve"> </w:t>
+      </w:r>
+      <w:r>
+        <w:rPr>
+          <w:rFonts w:hint="cs"/>
+          <w:rtl/>
+          <w:lang w:bidi="ar-AE"/>
+        </w:rPr>
+        <w:t xml:space="preserve">هل نحن مستعدون بأن نساعد </w:t>
+      </w:r>
+      <w:r>
+        <w:rPr>
+          <w:rFonts w:hint="cs"/>
+          <w:rtl/>
+          <w:lang w:bidi="ar-AE"/>
+        </w:rPr>
+        <w:t>أحدًا</w:t>
+      </w:r>
+      <w:r>
+        <w:rPr>
+          <w:rFonts w:hint="cs"/>
+          <w:rtl/>
+          <w:lang w:bidi="ar-AE"/>
+        </w:rPr>
+        <w:t xml:space="preserve"> يلجأ إلينا بملء الثقة (ربما في ساعة متأخرة)؟ هل نركع من أجله، ونعطيه ما أعطانا الله إياه؟</w:t>
       </w:r>
     </w:p>
     <w:p>
       <w:pPr>
-        <w:bidi/>
-        <w:spacing w:after="0"/>
         <w:jc w:val="both"/>
         <w:rPr>
-          <w:rtl/>
-        </w:rPr>
-      </w:pPr>
-      <w:r>
-        <w:rPr>
-          <w:rtl/>
-        </w:rPr>
-        <w:t>* ... يُظهر مجده بالأفعال.</w:t>
-      </w:r>
-    </w:p>
-    <w:p>
-      <w:pPr>
-        <w:bidi/>
-        <w:spacing w:after="0"/>
-        <w:jc w:val="both"/>
-        <w:rPr>
-          <w:rtl/>
-        </w:rPr>
-      </w:pPr>
-      <w:r>
-        <w:rPr>
-          <w:rtl/>
-        </w:rPr>
-        <w:t>* ... يحل بنعمته على الشعب.</w:t>
-      </w:r>
-    </w:p>
-    <w:p>
-      <w:pPr>
-        <w:bidi/>
-        <w:jc w:val="both"/>
-        <w:rPr>
-          <w:rtl/>
-        </w:rPr>
-      </w:pPr>
-      <w:r>
-        <w:rPr>
-          <w:rtl/>
-        </w:rPr>
-        <w:t>* ... يثبّت عمل أيديهم.</w:t>
-      </w:r>
-    </w:p>
-    <w:p>
-      <w:pPr>
-        <w:bidi/>
-        <w:jc w:val="both"/>
-        <w:rPr>
-          <w:rtl/>
-        </w:rPr>
-      </w:pPr>
-      <w:r>
-        <w:rPr>
-          <w:rtl/>
-        </w:rPr>
-        <w:t>إحصاء الأيام</w:t>
-      </w:r>
-    </w:p>
-    <w:p>
-      <w:pPr>
-        <w:bidi/>
-        <w:jc w:val="both"/>
-        <w:rPr>
-          <w:rtl/>
-        </w:rPr>
-      </w:pPr>
-      <w:r>
-        <w:rPr>
-          <w:rFonts w:hint="cs"/>
-          <w:rtl/>
-        </w:rPr>
-        <w:t>دعونا نتمعن في طلبة موسى الأولى، إنها تقول: "</w:t>
-      </w:r>
-      <w:r>
-        <w:rPr>
-          <w:rtl/>
-        </w:rPr>
-        <w:t>إِحْصَاءَ أَيَّامِنَا هكَذَا عَلِّمْنَا فَنُؤْتَى قَلْبَ حِكْمَةٍ.</w:t>
-      </w:r>
-      <w:r>
-        <w:rPr>
-          <w:rFonts w:hint="cs"/>
-          <w:rtl/>
-        </w:rPr>
-        <w:t>!" هذه الطلبة هي كتمهيد لباقي الطلبات، لأنه فقط مَن يحصي أيامه سيصلي طالبًا لطف الله ومعونته في كل يوم، كما فعل موسى.</w:t>
-      </w:r>
-    </w:p>
-    <w:p>
-      <w:pPr>
-        <w:bidi/>
-        <w:jc w:val="both"/>
-        <w:rPr>
-          <w:rtl/>
-        </w:rPr>
-      </w:pPr>
-      <w:r>
-        <w:rPr>
-          <w:rFonts w:hint="cs"/>
-          <w:rtl/>
-        </w:rPr>
-        <w:t>نحن نحتاج إلى تعليم الله لكيما نتعلم إحصاء أيام حياتنا القليلة</w:t>
-      </w:r>
-      <w:r>
-        <w:rPr>
-          <w:rFonts w:hint="cs"/>
-          <w:rtl/>
-        </w:rPr>
-        <w:t xml:space="preserve"> ولنكون حكماء. في ذلك بالطبع لا يدور الأمر حول إضافة بعض الأعداد (والذي يتطلب فقط القليل من الفهم)، وإنما علينا أن نوسّع تقديرنا وننميه في كل يوم يضمنه لنا الله الأزلي. إن الحكيم يعي في ذلك بأن كل يوم من الممكن أن يكون آخر يوم له على الأرض. أما الجاهل بالمقابل فهو يحسب فقط حساب بعض السنوات المريحة في حياته، ولكنه لا يحسب بأنه سيُستدعى إلى الأبدية. إن هذا يوضحه الرب في مثل فلاح الذرة الغني الأناني في صورة واضحة جدًا (لوقا 12: 16 </w:t>
-      </w:r>
-      <w:r>
-        <w:rPr>
-          <w:rtl/>
-        </w:rPr>
-        <w:t>–</w:t>
-      </w:r>
-      <w:r>
-        <w:rPr>
-          <w:rFonts w:hint="cs"/>
-          <w:rtl/>
-        </w:rPr>
-        <w:t xml:space="preserve"> 21).</w:t>
-      </w:r>
-    </w:p>
-    <w:p>
-      <w:pPr>
-        <w:bidi/>
-        <w:jc w:val="both"/>
-        <w:rPr>
-          <w:rFonts w:hint="cs"/>
-          <w:rtl/>
-        </w:rPr>
-      </w:pPr>
-      <w:r>
-        <w:rPr>
-          <w:rFonts w:hint="cs"/>
-          <w:rtl/>
-        </w:rPr>
-        <w:t>الرسول بولس يُري وجهة نظر هامة، كيف نحيا بحكمة: "</w:t>
-      </w:r>
-      <w:r>
-        <w:rPr>
-          <w:rtl/>
-        </w:rPr>
-        <w:t>اُسْلُكُوا بِحِكْمَةٍ مِنْ جِهَةِ الَّذِينَ هُمْ مِنْ خَارِجٍ، مُفْتَدِينَ الْوَقْتَ.</w:t>
-      </w:r>
-      <w:r>
-        <w:rPr>
-          <w:rFonts w:hint="cs"/>
-          <w:rtl/>
-        </w:rPr>
-        <w:t xml:space="preserve">" (كولوسي 4: 5؛ قارن أفسس 5: 15، 16). </w:t>
-      </w:r>
-      <w:r>
-        <w:rPr>
-          <w:rFonts w:hint="cs"/>
-          <w:rtl/>
-        </w:rPr>
-        <w:t>إن استفدنا من حياتنا العابرة سريعًا</w:t>
-      </w:r>
-      <w:r>
-        <w:rPr>
-          <w:rFonts w:hint="cs"/>
-          <w:rtl/>
-        </w:rPr>
-        <w:t xml:space="preserve"> لربح الناس للمسيح الذين هم من خارج من خلال سلوكنا وكلامنا، عندها سنكون فعلاً حكماء. هل نحن نحصي أيامنا في هذا المنظور؟ هل نستفيد من فرص لنُشير إلى الرب يسوع؟ هل نسلّم الإنجيل لآخرين؟ عندها يمكننا أن نصلي مع موسى بجراءة: "</w:t>
-      </w:r>
-      <w:r>
-        <w:rPr>
-          <w:rtl/>
-        </w:rPr>
-        <w:t>وَعَمَلَ أَيْدِينَا ثَبِّتْ عَلَيْنَا، وَعَمَلَ أَيْدِينَا ثَبِّتْهُ.</w:t>
-      </w:r>
-      <w:r>
-        <w:rPr>
-          <w:rFonts w:hint="cs"/>
-          <w:rtl/>
-        </w:rPr>
-        <w:t>" (مزمور 90: 17).</w:t>
+          <w:rFonts w:hint="cs"/>
+          <w:lang w:bidi="ar-AE"/>
+        </w:rPr>
+      </w:pPr>
+      <w:r>
+        <w:rPr>
+          <w:rFonts w:hint="cs"/>
+          <w:rtl/>
+          <w:lang w:bidi="ar-AE"/>
+        </w:rPr>
+        <w:t xml:space="preserve"> </w:t>
       </w:r>
     </w:p>
     <w:sectPr>
       <w:pgSz w:w="11906" w:h="16838"/>
-      <w:pgMar w:top="1440" w:right="1440" w:bottom="1440" w:left="1440" w:header="708" w:footer="708" w:gutter="0"/>
+      <w:pgMar w:top="1440" w:right="1800" w:bottom="1440" w:left="1800" w:header="708" w:footer="708" w:gutter="0"/>
       <w:cols w:space="708"/>
+      <w:bidi/>
+      <w:rtlGutter/>
       <w:docGrid w:linePitch="360"/>
     </w:sectPr>
   </w:body>
 </w:document>
 </file>
 
+<file path=word/numbering.xml><?xml version="1.0" encoding="utf-8"?>
+<w:numbering xmlns:wpc="http://schemas.microsoft.com/office/word/2010/wordprocessingCanvas" xmlns:cx="http://schemas.microsoft.com/office/drawing/2014/chartex" xmlns:cx1="http://schemas.microsoft.com/office/drawing/2015/9/8/chartex" xmlns:cx2="http://schemas.microsoft.com/office/drawing/2015/10/21/chartex" xmlns:cx3="http://schemas.microsoft.com/office/drawing/2016/5/9/chartex" xmlns:cx4="http://schemas.microsoft.com/office/drawing/2016/5/10/chartex" xmlns:cx5="http://schemas.microsoft.com/office/drawing/2016/5/11/chartex" xmlns:cx6="http://schemas.microsoft.com/office/drawing/2016/5/12/chartex" xmlns:cx7="http://schemas.microsoft.com/office/drawing/2016/5/13/chartex" xmlns:cx8="http://schemas.microsoft.com/office/drawing/2016/5/14/chartex" xmlns:mc="http://schemas.openxmlformats.org/markup-compatibility/2006" xmlns:aink="http://schemas.microsoft.com/office/drawing/2016/ink" xmlns:am3d="http://schemas.microsoft.com/office/drawing/2017/model3d" xmlns:o="urn:schemas-microsoft-com:office:office" xmlns:r="http://schemas.openxmlformats.org/officeDocument/2006/relationships" xmlns:m="http://schemas.openxmlformats.org/officeDocument/2006/math" xmlns:v="urn:schemas-microsoft-com:vml" xmlns:wp14="http://schemas.microsoft.com/office/word/2010/wordprocessingDrawing" xmlns:wp="http://schemas.openxmlformats.org/drawingml/2006/wordprocessingDrawing" xmlns:w10="urn:schemas-microsoft-com:office:word" xmlns:w="http://schemas.openxmlformats.org/wordprocessingml/2006/main" xmlns:w14="http://schemas.microsoft.com/office/word/2010/wordml" xmlns:w15="http://schemas.microsoft.com/office/word/2012/wordml" xmlns:w16cid="http://schemas.microsoft.com/office/word/2016/wordml/cid" xmlns:w16se="http://schemas.microsoft.com/office/word/2015/wordml/symex" xmlns:wpg="http://schemas.microsoft.com/office/word/2010/wordprocessingGroup" xmlns:wpi="http://schemas.microsoft.com/office/word/2010/wordprocessingInk" xmlns:wne="http://schemas.microsoft.com/office/word/2006/wordml" xmlns:wps="http://schemas.microsoft.com/office/word/2010/wordprocessingShape" mc:Ignorable="w14 w15 w16se w16cid wp14">
+  <w:abstractNum w:abstractNumId="0" w15:restartNumberingAfterBreak="0">
+    <w:nsid w:val="088B6B61"/>
+    <w:multiLevelType w:val="hybridMultilevel"/>
+    <w:tmpl w:val="D36EAD42"/>
+    <w:lvl w:ilvl="0" w:tplc="A8344C5C">
+      <w:start w:val="3"/>
+      <w:numFmt w:val="bullet"/>
+      <w:lvlText w:val=""/>
+      <w:lvlJc w:val="left"/>
+      <w:pPr>
+        <w:ind w:left="720" w:hanging="360"/>
+      </w:pPr>
+      <w:rPr>
+        <w:rFonts w:ascii="Symbol" w:eastAsiaTheme="minorHAnsi" w:hAnsi="Symbol" w:cs="Sakkal Majalla" w:hint="default"/>
+      </w:rPr>
+    </w:lvl>
+    <w:lvl w:ilvl="1" w:tplc="04090003" w:tentative="1">
+      <w:start w:val="1"/>
+      <w:numFmt w:val="bullet"/>
+      <w:lvlText w:val="o"/>
+      <w:lvlJc w:val="left"/>
+      <w:pPr>
+        <w:ind w:left="1440" w:hanging="360"/>
+      </w:pPr>
+      <w:rPr>
+        <w:rFonts w:ascii="Courier New" w:hAnsi="Courier New" w:cs="Courier New" w:hint="default"/>
+      </w:rPr>
+    </w:lvl>
+    <w:lvl w:ilvl="2" w:tplc="04090005" w:tentative="1">
+      <w:start w:val="1"/>
+      <w:numFmt w:val="bullet"/>
+      <w:lvlText w:val=""/>
+      <w:lvlJc w:val="left"/>
+      <w:pPr>
+        <w:ind w:left="2160" w:hanging="360"/>
+      </w:pPr>
+      <w:rPr>
+        <w:rFonts w:ascii="Wingdings" w:hAnsi="Wingdings" w:hint="default"/>
+      </w:rPr>
+    </w:lvl>
+    <w:lvl w:ilvl="3" w:tplc="04090001" w:tentative="1">
+      <w:start w:val="1"/>
+      <w:numFmt w:val="bullet"/>
+      <w:lvlText w:val=""/>
+      <w:lvlJc w:val="left"/>
+      <w:pPr>
+        <w:ind w:left="2880" w:hanging="360"/>
+      </w:pPr>
+      <w:rPr>
+        <w:rFonts w:ascii="Symbol" w:hAnsi="Symbol" w:hint="default"/>
+      </w:rPr>
+    </w:lvl>
+    <w:lvl w:ilvl="4" w:tplc="04090003" w:tentative="1">
+      <w:start w:val="1"/>
+      <w:numFmt w:val="bullet"/>
+      <w:lvlText w:val="o"/>
+      <w:lvlJc w:val="left"/>
+      <w:pPr>
+        <w:ind w:left="3600" w:hanging="360"/>
+      </w:pPr>
+      <w:rPr>
+        <w:rFonts w:ascii="Courier New" w:hAnsi="Courier New" w:cs="Courier New" w:hint="default"/>
+      </w:rPr>
+    </w:lvl>
+    <w:lvl w:ilvl="5" w:tplc="04090005" w:tentative="1">
+      <w:start w:val="1"/>
+      <w:numFmt w:val="bullet"/>
+      <w:lvlText w:val=""/>
+      <w:lvlJc w:val="left"/>
+      <w:pPr>
+        <w:ind w:left="4320" w:hanging="360"/>
+      </w:pPr>
+      <w:rPr>
+        <w:rFonts w:ascii="Wingdings" w:hAnsi="Wingdings" w:hint="default"/>
+      </w:rPr>
+    </w:lvl>
+    <w:lvl w:ilvl="6" w:tplc="04090001" w:tentative="1">
+      <w:start w:val="1"/>
+      <w:numFmt w:val="bullet"/>
+      <w:lvlText w:val=""/>
+      <w:lvlJc w:val="left"/>
+      <w:pPr>
+        <w:ind w:left="5040" w:hanging="360"/>
+      </w:pPr>
+      <w:rPr>
+        <w:rFonts w:ascii="Symbol" w:hAnsi="Symbol" w:hint="default"/>
+      </w:rPr>
+    </w:lvl>
+    <w:lvl w:ilvl="7" w:tplc="04090003" w:tentative="1">
+      <w:start w:val="1"/>
+      <w:numFmt w:val="bullet"/>
+      <w:lvlText w:val="o"/>
+      <w:lvlJc w:val="left"/>
+      <w:pPr>
+        <w:ind w:left="5760" w:hanging="360"/>
+      </w:pPr>
+      <w:rPr>
+        <w:rFonts w:ascii="Courier New" w:hAnsi="Courier New" w:cs="Courier New" w:hint="default"/>
+      </w:rPr>
+    </w:lvl>
+    <w:lvl w:ilvl="8" w:tplc="04090005" w:tentative="1">
+      <w:start w:val="1"/>
+      <w:numFmt w:val="bullet"/>
+      <w:lvlText w:val=""/>
+      <w:lvlJc w:val="left"/>
+      <w:pPr>
+        <w:ind w:left="6480" w:hanging="360"/>
+      </w:pPr>
+      <w:rPr>
+        <w:rFonts w:ascii="Wingdings" w:hAnsi="Wingdings" w:hint="default"/>
+      </w:rPr>
+    </w:lvl>
+  </w:abstractNum>
+  <w:num w:numId="1">
+    <w:abstractNumId w:val="0"/>
+  </w:num>
+</w:numbering>
+</file>
+
 <file path=word/styles.xml><?xml version="1.0" encoding="utf-8"?>
-<w:styles xmlns:mc="http://schemas.openxmlformats.org/markup-compatibility/2006" xmlns:r="http://schemas.openxmlformats.org/officeDocument/2006/relationships" xmlns:w="http://schemas.openxmlformats.org/wordprocessingml/2006/main" xmlns:w14="http://schemas.microsoft.com/office/word/2010/wordml" xmlns:w15="http://schemas.microsoft.com/office/word/2012/wordml" xmlns:w16cex="http://schemas.microsoft.com/office/word/2018/wordml/cex" xmlns:w16cid="http://schemas.microsoft.com/office/word/2016/wordml/cid" xmlns:w16="http://schemas.microsoft.com/office/word/2018/wordml" xmlns:w16sdtdh="http://schemas.microsoft.com/office/word/2020/wordml/sdtdatahash" xmlns:w16se="http://schemas.microsoft.com/office/word/2015/wordml/symex" mc:Ignorable="w14 w15 w16se w16cid w16 w16cex w16sdtdh">
+<w:styles xmlns:mc="http://schemas.openxmlformats.org/markup-compatibility/2006" xmlns:r="http://schemas.openxmlformats.org/officeDocument/2006/relationships" xmlns:w="http://schemas.openxmlformats.org/wordprocessingml/2006/main" xmlns:w14="http://schemas.microsoft.com/office/word/2010/wordml" xmlns:w15="http://schemas.microsoft.com/office/word/2012/wordml" xmlns:w16cid="http://schemas.microsoft.com/office/word/2016/wordml/cid" xmlns:w16se="http://schemas.microsoft.com/office/word/2015/wordml/symex" mc:Ignorable="w14 w15 w16se w16cid">
   <w:docDefaults>
     <w:rPrDefault>
       <w:rPr>
@@ -795,10 +884,9 @@
   <w:style w:type="paragraph" w:default="1" w:styleId="Normal">
     <w:name w:val="Normal"/>
     <w:qFormat/>
-    <w:rPr>
-      <w:noProof/>
-      <w:lang w:bidi="ar-EG"/>
-    </w:rPr>
+    <w:pPr>
+      <w:bidi/>
+    </w:pPr>
   </w:style>
   <w:style w:type="character" w:default="1" w:styleId="DefaultParagraphFont">
     <w:name w:val="Default Paragraph Font"/>
@@ -832,7 +920,7 @@
     <w:basedOn w:val="DefaultParagraphFont"/>
     <w:uiPriority w:val="99"/>
     <w:unhideWhenUsed/>
-    <w:rsid w:val="00462125"/>
+    <w:rsid w:val="00B31E41"/>
     <w:rPr>
       <w:color w:val="0563C1" w:themeColor="hyperlink"/>
       <w:u w:val="single"/>
@@ -844,29 +932,28 @@
     <w:uiPriority w:val="99"/>
     <w:semiHidden/>
     <w:unhideWhenUsed/>
-    <w:rsid w:val="00462125"/>
+    <w:rsid w:val="00B31E41"/>
     <w:rPr>
       <w:color w:val="605E5C"/>
       <w:shd w:val="clear" w:color="auto" w:fill="E1DFDD"/>
     </w:rPr>
   </w:style>
-  <w:style w:type="character" w:styleId="FollowedHyperlink">
-    <w:name w:val="FollowedHyperlink"/>
-    <w:basedOn w:val="DefaultParagraphFont"/>
-    <w:uiPriority w:val="99"/>
-    <w:semiHidden/>
-    <w:unhideWhenUsed/>
-    <w:rsid w:val="006355B9"/>
-    <w:rPr>
-      <w:color w:val="954F72" w:themeColor="followedHyperlink"/>
-      <w:u w:val="single"/>
-    </w:rPr>
+  <w:style w:type="paragraph" w:styleId="ListParagraph">
+    <w:name w:val="List Paragraph"/>
+    <w:basedOn w:val="Normal"/>
+    <w:uiPriority w:val="34"/>
+    <w:qFormat/>
+    <w:rsid w:val="00B31E41"/>
+    <w:pPr>
+      <w:ind w:left="720"/>
+      <w:contextualSpacing/>
+    </w:pPr>
   </w:style>
 </w:styles>
 </file>
 
 <file path=word/theme/theme1.xml><?xml version="1.0" encoding="utf-8"?>
-<a:theme xmlns:a="http://schemas.openxmlformats.org/drawingml/2006/main" name="ערכת נושא Office">
+<a:theme xmlns:a="http://schemas.openxmlformats.org/drawingml/2006/main" name="Office Theme">
   <a:themeElements>
     <a:clrScheme name="Office">
       <a:dk1>

</xml_diff>